<commit_message>
Add matched TITAN GigaSSL ProvGigaPath benchmark
</commit_message>
<xml_diff>
--- a/manuscript/response_to_reviewer_JTM.docx
+++ b/manuscript/response_to_reviewer_JTM.docx
@@ -12,7 +12,7 @@
     </w:p>
     <w:p>
       <w:r>
-        <w:t>Manuscript: A systematic patient-level benchmark and reusable model resource for molecular and derived immune-feature prediction from pretrained TITAN whole-slide representations across 32 TCGA cancers</w:t>
+        <w:t>Manuscript: A patient-level comparison of pathology foundation models for molecular and derived immune-feature prediction across 32 TCGA cancers</w:t>
       </w:r>
     </w:p>
     <w:p>
@@ -264,7 +264,7 @@
     </w:p>
     <w:p>
       <w:r>
-        <w:t>The analysis repository (https://github.com/tkcaccia/titan-prediction) remains public and contains the analysis plan, source URLs/checksums, software commit, eligibility tables, code, out-of-fold outputs, literature crosswalk, model registry and locked external-evaluation protocol. At the authors' request, the TITANPred repository (https://github.com/tkcaccia/TITANPred) is now private. The manuscript no longer claims that the package or 323 fitted objects are publicly downloadable. A public model release, if permitted, and a persistent DOI remain future release decisions; reviewers can be granted controlled access when authorised.</w:t>
+        <w:t>The analysis repository (https://github.com/tkcaccia/titan-prediction) remains public and contains the analysis plan, source URLs/checksums, software commit, eligibility tables, code, out-of-fold outputs, literature crosswalk, model registry and locked external-evaluation protocol. At the authors' request, the TITANPred repository (https://github.com/tkcaccia/PathoFMPred) is now private. The manuscript no longer claims that the package or 323 fitted objects are publicly downloadable. A public model release, if permitted, and a persistent DOI remain future release decisions; reviewers can be granted controlled access when authorised.</w:t>
       </w:r>
     </w:p>
     <w:p>

</xml_diff>